<commit_message>
Premium 2-col DOCX (navy house palette, callout box, balanced last page); SUSCOM submission kit (elsarticle + notes)
Co-Authored-By: Claude Fable 5 <noreply@anthropic.com>
</commit_message>
<xml_diff>
--- a/docs/GPTEnergy_2col.docx
+++ b/docs/GPTEnergy_2col.docx
@@ -13,6 +13,9 @@
         <w:widowControl w:val="1"/>
       </w:pPr>
       <w:r>
+        <w:rPr>
+          <w:color w:val="14385C"/>
+        </w:rPr>
         <w:t xml:space="preserve">The Joule Point: an Energy-Optimal Operating Point for AI Inference</w:t>
       </w:r>
     </w:p>
@@ -50,12 +53,17 @@
               <w:spacing w:before="0" w:after="40" w:line="240" w:lineRule="auto"/>
               <w:jc w:val="center"/>
             </w:pPr>
-            <w:r/>
+            <w:r>
+              <w:rPr>
+                <w:color w:val="5A626C"/>
+              </w:rPr>
+            </w:r>
             <w:r>
               <w:rPr>
                 <w:rFonts w:ascii="Georgia" w:hAnsi="Georgia"/>
                 <w:b/>
                 <w:i w:val="0"/>
+                <w:color w:val="2C3138"/>
                 <w:sz w:val="22"/>
               </w:rPr>
               <w:t>Alexander Apartsin</w:t>
@@ -65,6 +73,7 @@
                 <w:rFonts w:ascii="Georgia" w:hAnsi="Georgia"/>
                 <w:b/>
                 <w:i w:val="0"/>
+                <w:color w:val="5A626C"/>
                 <w:sz w:val="22"/>
                 <w:vertAlign w:val="superscript"/>
               </w:rPr>
@@ -75,6 +84,7 @@
                 <w:rFonts w:ascii="Georgia" w:hAnsi="Georgia"/>
                 <w:b/>
                 <w:i w:val="0"/>
+                <w:color w:val="2C3138"/>
                 <w:sz w:val="22"/>
               </w:rPr>
               <w:t xml:space="preserve"> </w:t>
@@ -84,6 +94,7 @@
                 <w:rFonts w:ascii="Georgia" w:hAnsi="Georgia"/>
                 <w:b/>
                 <w:i w:val="0"/>
+                <w:color w:val="2C3138"/>
                 <w:sz w:val="22"/>
               </w:rPr>
               <w:t xml:space="preserve"> ·  Yehudit Aperstein</w:t>
@@ -93,6 +104,7 @@
                 <w:rFonts w:ascii="Georgia" w:hAnsi="Georgia"/>
                 <w:b/>
                 <w:i w:val="0"/>
+                <w:color w:val="5A626C"/>
                 <w:sz w:val="22"/>
                 <w:vertAlign w:val="superscript"/>
               </w:rPr>
@@ -117,12 +129,17 @@
               <w:spacing w:before="0" w:after="120" w:line="240" w:lineRule="auto"/>
               <w:jc w:val="center"/>
             </w:pPr>
-            <w:r/>
+            <w:r>
+              <w:rPr>
+                <w:color w:val="5A626C"/>
+              </w:rPr>
+            </w:r>
             <w:r>
               <w:rPr>
                 <w:rFonts w:ascii="Georgia" w:hAnsi="Georgia"/>
                 <w:b w:val="0"/>
                 <w:i/>
+                <w:color w:val="5A626C"/>
                 <w:sz w:val="19"/>
                 <w:vertAlign w:val="superscript"/>
               </w:rPr>
@@ -133,6 +150,7 @@
                 <w:rFonts w:ascii="Georgia" w:hAnsi="Georgia"/>
                 <w:b w:val="0"/>
                 <w:i/>
+                <w:color w:val="5A626C"/>
                 <w:sz w:val="19"/>
               </w:rPr>
               <w:t xml:space="preserve">Holon Institute of Technology, Holon, Israel   </w:t>
@@ -142,6 +160,7 @@
                 <w:rFonts w:ascii="Georgia" w:hAnsi="Georgia"/>
                 <w:b w:val="0"/>
                 <w:i/>
+                <w:color w:val="5A626C"/>
                 <w:sz w:val="19"/>
                 <w:vertAlign w:val="superscript"/>
               </w:rPr>
@@ -152,6 +171,7 @@
                 <w:rFonts w:ascii="Georgia" w:hAnsi="Georgia"/>
                 <w:b w:val="0"/>
                 <w:i/>
+                <w:color w:val="5A626C"/>
                 <w:sz w:val="19"/>
               </w:rPr>
               <w:t>Afeka Academic College of Engineering, Tel Aviv, Israel</w:t>
@@ -169,6 +189,10 @@
         <w:widowControl w:val="1"/>
       </w:pPr>
       <w:r>
+        <w:rPr>
+          <w:smallCaps/>
+          <w:color w:val="14385C"/>
+        </w:rPr>
         <w:t xml:space="preserve">Abstract</w:t>
       </w:r>
     </w:p>
@@ -341,6 +365,9 @@
         <w:widowControl w:val="1"/>
       </w:pPr>
       <w:r>
+        <w:rPr>
+          <w:color w:val="14385C"/>
+        </w:rPr>
         <w:t xml:space="preserve">1. Introduction</w:t>
       </w:r>
     </w:p>
@@ -1003,6 +1030,9 @@
         <w:widowControl w:val="1"/>
       </w:pPr>
       <w:r>
+        <w:rPr>
+          <w:color w:val="14385C"/>
+        </w:rPr>
         <w:t xml:space="preserve">2. Related work</w:t>
       </w:r>
     </w:p>
@@ -1760,6 +1790,9 @@
         <w:widowControl w:val="1"/>
       </w:pPr>
       <w:r>
+        <w:rPr>
+          <w:color w:val="14385C"/>
+        </w:rPr>
         <w:t xml:space="preserve">3. Energy space and its calculus</w:t>
       </w:r>
     </w:p>
@@ -2304,6 +2337,9 @@
         <w:widowControl w:val="1"/>
       </w:pPr>
       <w:r>
+        <w:rPr>
+          <w:color w:val="14385C"/>
+        </w:rPr>
         <w:t xml:space="preserve">4. The ELF dataset</w:t>
       </w:r>
     </w:p>
@@ -2750,6 +2786,7 @@
         <w:rPr>
           <w:b/>
           <w:i/>
+          <w:color w:val="14385C"/>
         </w:rPr>
         <w:t>Figure 1.</w:t>
       </w:r>
@@ -2757,6 +2794,7 @@
         <w:rPr>
           <w:b w:val="0"/>
           <w:i/>
+          <w:color w:val="3D434B"/>
         </w:rPr>
         <w:t xml:space="preserve"> </w:t>
       </w:r>
@@ -2764,6 +2802,7 @@
         <w:rPr>
           <w:b w:val="0"/>
           <w:i/>
+          <w:color w:val="3D434B"/>
         </w:rPr>
         <w:t>Watts or clock, the same energy curve. On the A10G (convnext_small, batch 512) the power-cap sweep (navy) and the graphics-clock sweep (orange) give the same energy per inference where their board-draw ranges overlap (mean difference about 3 per cent), and the clock reaches below the power cap's driver floor (dotted line) to a lower draw. Energy is normalized to the uncapped value.</w:t>
       </w:r>
@@ -2778,6 +2817,9 @@
         <w:widowControl w:val="1"/>
       </w:pPr>
       <w:r>
+        <w:rPr>
+          <w:color w:val="14385C"/>
+        </w:rPr>
         <w:t xml:space="preserve">5. The response surface and its law</w:t>
       </w:r>
     </w:p>
@@ -3699,6 +3741,7 @@
         <w:rPr>
           <w:b/>
           <w:i/>
+          <w:color w:val="14385C"/>
         </w:rPr>
         <w:t>Figure 2.</w:t>
       </w:r>
@@ -3706,6 +3749,7 @@
         <w:rPr>
           <w:b w:val="0"/>
           <w:i/>
+          <w:color w:val="3D434B"/>
         </w:rPr>
         <w:t xml:space="preserve"> </w:t>
       </w:r>
@@ -3713,6 +3757,7 @@
         <w:rPr>
           <w:b w:val="0"/>
           <w:i/>
+          <w:color w:val="3D434B"/>
         </w:rPr>
         <w:t>The response law P(θ)=P0+aθβ is a card property. One panel per GPU (A100, A10G, L4); each dot is a measured operating point for one of the 20 workloads in the loaded regime, with the rate normalized to that workload's own maximum and power to the card's TDP. All workloads closely follow a single fitted law per card (line), showing the exponent travels with the card, not the model: pooled fit R2 of 0.92 (A100), 0.88 (A10G), and 0.95 (L4), with β from about 1.5 on the L4 to 7.4 on the A10G.</w:t>
       </w:r>
@@ -3727,6 +3772,9 @@
         <w:widowControl w:val="1"/>
       </w:pPr>
       <w:r>
+        <w:rPr>
+          <w:color w:val="14385C"/>
+        </w:rPr>
         <w:t xml:space="preserve">6. The Joule Point, and the price of reaching it</w:t>
       </w:r>
     </w:p>
@@ -3912,6 +3960,7 @@
         <w:rPr>
           <w:b/>
           <w:i/>
+          <w:color w:val="14385C"/>
         </w:rPr>
         <w:t>Figure 3.</w:t>
       </w:r>
@@ -3919,6 +3968,7 @@
         <w:rPr>
           <w:b w:val="0"/>
           <w:i/>
+          <w:color w:val="3D434B"/>
         </w:rPr>
         <w:t xml:space="preserve"> </w:t>
       </w:r>
@@ -3926,6 +3976,7 @@
         <w:rPr>
           <w:b w:val="0"/>
           <w:i/>
+          <w:color w:val="3D434B"/>
         </w:rPr>
         <w:t>Every card has an energy U-shape, shown with the best-illustrating workload per card: energy per inference normalized to each card's own uncapped value (so every curve starts at 1.0 and dips by the energy saved), versus board draw as a fraction of TDP. The shaded band is one standard deviation over repetitions; the dot marks the Joule Point. Curves: ViT-B/32 on the A100, ResNet-50 on the A10G, and wide-ResNet-50 on the L4. The L4 reaches its interior minimum below the power-cap floor, so its well is exposed by lowering the graphics clock instead.</w:t>
       </w:r>
@@ -4599,6 +4650,7 @@
         <w:rPr>
           <w:b/>
           <w:i/>
+          <w:color w:val="14385C"/>
         </w:rPr>
         <w:t>Figure 4.</w:t>
       </w:r>
@@ -4606,6 +4658,7 @@
         <w:rPr>
           <w:b w:val="0"/>
           <w:i/>
+          <w:color w:val="3D434B"/>
         </w:rPr>
         <w:t xml:space="preserve"> </w:t>
       </w:r>
@@ -4613,6 +4666,7 @@
         <w:rPr>
           <w:b w:val="0"/>
           <w:i/>
+          <w:color w:val="3D434B"/>
         </w:rPr>
         <w:t>Why energy per inference is U-shaped, and what lowering the operating point costs (A10G, ResNet-50, via the graphics clock), each series normalized to its uncapped value. As the operating point is lowered, board power per second drops (red) but each inference takes longer (orange); their product, energy per inference (navy), is minimized in between at the Joule Point (dot). Left of the Joule Point a small further energy saving costs a large latency rise; right of it a steep energy cost buys little speed.</w:t>
       </w:r>
@@ -4789,6 +4843,7 @@
         <w:rPr>
           <w:b/>
           <w:i/>
+          <w:color w:val="14385C"/>
         </w:rPr>
         <w:t>Table 1.</w:t>
       </w:r>
@@ -4796,6 +4851,7 @@
         <w:rPr>
           <w:b w:val="0"/>
           <w:i/>
+          <w:color w:val="3D434B"/>
         </w:rPr>
         <w:t xml:space="preserve"> </w:t>
       </w:r>
@@ -4803,6 +4859,7 @@
         <w:rPr>
           <w:b w:val="0"/>
           <w:i/>
+          <w:color w:val="3D434B"/>
         </w:rPr>
         <w:t>The Joule Point on the two large GPUs, under load: its location (per cent of TDP), the energy it saves per inference versus uncapped, the extra cards (equal to the latency ratio) needed to hold throughput, and the spread and penalty of using one fixed per-card cap across the twenty workloads.</w:t>
       </w:r>
@@ -5404,12 +5461,21 @@
     <w:p>
       <w:pPr>
         <w:pStyle w:val="BodyText"/>
+        <w:ind w:left="120"/>
         <w:jc w:val="both"/>
         <w:keepNext w:val="0"/>
         <w:keepLines w:val="0"/>
         <w:widowControl w:val="1"/>
-      </w:pPr>
-      <w:r>
+        <w:pBdr>
+          <w:left w:val="single" w:sz="18" w:space="6" w:color="14385C"/>
+        </w:pBdr>
+        <w:shd w:val="clear" w:fill="F2F5F8"/>
+      </w:pPr>
+      <w:r>
+        <w:rPr>
+          <w:i/>
+          <w:color w:val="2C3138"/>
+        </w:rPr>
         <w:t xml:space="preserve">Under load, one static cap per card, set once, has a mean energy penalty below one per cent versus each job's own optimum, so the online per-job search that prior energy-aware systems run is unnecessary in this regime.</w:t>
       </w:r>
     </w:p>
@@ -5445,6 +5511,9 @@
         <w:widowControl w:val="1"/>
       </w:pPr>
       <w:r>
+        <w:rPr>
+          <w:color w:val="14385C"/>
+        </w:rPr>
         <w:t xml:space="preserve">7. Scheduling in energy space: a fleet simulation</w:t>
       </w:r>
     </w:p>
@@ -5796,6 +5865,7 @@
         <w:rPr>
           <w:b/>
           <w:i/>
+          <w:color w:val="14385C"/>
         </w:rPr>
         <w:t>Figure 5.</w:t>
       </w:r>
@@ -5803,6 +5873,7 @@
         <w:rPr>
           <w:b w:val="0"/>
           <w:i/>
+          <w:color w:val="3D434B"/>
         </w:rPr>
         <w:t xml:space="preserve"> </w:t>
       </w:r>
@@ -5810,6 +5881,7 @@
         <w:rPr>
           <w:b w:val="0"/>
           <w:i/>
+          <w:color w:val="3D434B"/>
         </w:rPr>
         <w:t>Compute-power frontier on a fleet of 18 identical A100s, one measured model per GPU, computed deterministically from the measured cap-sweep curves (repetitions averaged); this is the static allocation optimum, not the closed-loop trace. The x-axis sweeps the fleet power budget from 100 down to 40 per cent of the 7.2 kW total TDP. At each budget, energy-space allocation (each GPU its own cap, the exact optimum over the measured cap grid) is compared with the uniform baseline (one fleet-wide cap, the largest measured cap that fits the budget on all 18 GPUs). Left: useful compute, each model's throughput normalized to its own full-power peak and summed. Right: SLO goodput, the number of jobs whose latency stays within 10 per cent of that model's full-power latency. The advantage is modest for smooth throughput and decisive for goodput: as the budget tightens the uniform baseline collapses while the per-GPU assignment degrades gracefully. Both panels are computed on the saturating-batch sweeps, the loaded regime of Sections 5 to 7.</w:t>
       </w:r>
@@ -5878,6 +5950,9 @@
         <w:widowControl w:val="1"/>
       </w:pPr>
       <w:r>
+        <w:rPr>
+          <w:color w:val="14385C"/>
+        </w:rPr>
         <w:t xml:space="preserve">8. Implications for AI data center operators</w:t>
       </w:r>
     </w:p>
@@ -6083,6 +6158,7 @@
         <w:rPr>
           <w:b/>
           <w:i/>
+          <w:color w:val="14385C"/>
         </w:rPr>
         <w:t>Figure 6.</w:t>
       </w:r>
@@ -6090,6 +6166,7 @@
         <w:rPr>
           <w:b w:val="0"/>
           <w:i/>
+          <w:color w:val="3D434B"/>
         </w:rPr>
         <w:t xml:space="preserve"> </w:t>
       </w:r>
@@ -6097,6 +6174,7 @@
         <w:rPr>
           <w:b w:val="0"/>
           <w:i/>
+          <w:color w:val="3D434B"/>
         </w:rPr>
         <w:t>When power, not capital, is the binding constraint, the Joule Point is the interior optimum. Behind a fixed 1 MW feed (illustrated on the A100 running ViT-B/32 at batch 64), installing more GPUs forces each to a deeper cap (top axis), shifting the megawatt from dynamic, useful compute (blue) to the static idle floor (grey, taken as the least measured board draw). Served inferences per MW (red) peak at the Joule Point, near 5,500 cards, about 50 per cent above running the same megawatt uncapped; installing more cards is strictly dominated, serving fewer inferences at higher per-request latency (orange, right axis, log scale). Both served throughput and latency are relative to the uncapped operating point (= 1.0, the 100 per cent-TDP reference). This is the power-limited, demand-saturated regime; where demand is limited instead, one installs only enough cards to meet it and caps to the least SLO-feasible power (Section 7).</w:t>
       </w:r>
@@ -6111,6 +6189,9 @@
         <w:widowControl w:val="1"/>
       </w:pPr>
       <w:r>
+        <w:rPr>
+          <w:color w:val="14385C"/>
+        </w:rPr>
         <w:t xml:space="preserve">9. Limitations</w:t>
       </w:r>
     </w:p>
@@ -6186,6 +6267,9 @@
         <w:widowControl w:val="1"/>
       </w:pPr>
       <w:r>
+        <w:rPr>
+          <w:color w:val="14385C"/>
+        </w:rPr>
         <w:t xml:space="preserve">10. Conclusion and future work</w:t>
       </w:r>
     </w:p>
@@ -6246,6 +6330,9 @@
         <w:widowControl w:val="1"/>
       </w:pPr>
       <w:r>
+        <w:rPr>
+          <w:color w:val="14385C"/>
+        </w:rPr>
         <w:t xml:space="preserve">Data and code availability</w:t>
       </w:r>
     </w:p>
@@ -6304,6 +6391,9 @@
         <w:widowControl w:val="1"/>
       </w:pPr>
       <w:r>
+        <w:rPr>
+          <w:color w:val="14385C"/>
+        </w:rPr>
         <w:t xml:space="preserve">References</w:t>
       </w:r>
     </w:p>
@@ -7857,6 +7947,17 @@
     </w:p>
     <w:bookmarkEnd w:id="39"/>
     <w:bookmarkEnd w:id="40"/>
+    <w:p>
+      <w:pPr>
+        <w:sectPr>
+          <w:type w:val="continuous"/>
+          <w:pgSz w:h="15840" w:w="12240"/>
+          <w:pgMar w:bottom="1080" w:footer="720" w:gutter="0" w:header="720" w:left="1080" w:right="1080" w:top="1080"/>
+          <w:cols w:num="2" w:space="288" w:equalWidth="1"/>
+          <w:docGrid w:linePitch="360"/>
+        </w:sectPr>
+      </w:pPr>
+    </w:p>
     <w:sectPr>
       <w:type w:val="continuous"/>
       <w:pgSz w:h="15840" w:w="12240"/>

</xml_diff>

<commit_message>
Top-right badges link all four deliverables (PDF/DOCX x 1-col/2-col); improved 2-col layout (wide Figure 2 float, tighter figure cap)
Co-Authored-By: Claude Fable 5 <noreply@anthropic.com>
</commit_message>
<xml_diff>
--- a/docs/GPTEnergy_2col.docx
+++ b/docs/GPTEnergy_2col.docx
@@ -3679,6 +3679,31 @@
     </w:p>
     <w:p>
       <w:pPr>
+        <w:spacing w:before="0" w:after="0" w:line="440" w:lineRule="exact"/>
+        <w:rPr>
+          <w:sz w:val="2"/>
+          <w:szCs w:val="2"/>
+        </w:rPr>
+      </w:pPr>
+    </w:p>
+    <w:p>
+      <w:pPr>
+        <w:spacing w:before="0" w:after="0" w:line="20" w:lineRule="exact"/>
+        <w:rPr>
+          <w:sz w:val="2"/>
+          <w:szCs w:val="2"/>
+        </w:rPr>
+        <w:sectPr>
+          <w:type w:val="continuous"/>
+          <w:pgSz w:h="15840" w:w="12240"/>
+          <w:pgMar w:bottom="1080" w:footer="720" w:gutter="0" w:header="720" w:left="1080" w:right="1080" w:top="1080"/>
+          <w:cols w:num="2" w:space="288" w:equalWidth="1"/>
+          <w:docGrid w:linePitch="360"/>
+        </w:sectPr>
+      </w:pPr>
+    </w:p>
+    <w:p>
+      <w:pPr>
         <w:pStyle w:val="BodyText"/>
         <w:jc w:val="center"/>
         <w:keepNext/>
@@ -3688,14 +3713,14 @@
       <w:r>
         <w:drawing>
           <wp:inline>
-            <wp:extent cx="2984601" cy="6132195"/>
+            <wp:extent cx="6400800" cy="2032839"/>
             <wp:effectExtent b="0" l="0" r="0" t="0"/>
             <wp:docPr descr="P(\theta) law fit" title="" id="17" name="Picture"/>
             <a:graphic>
               <a:graphicData uri="http://schemas.openxmlformats.org/drawingml/2006/picture">
                 <pic:pic>
                   <pic:nvPicPr>
-                    <pic:cNvPr descr="../power_shaping/figures/fig_law_fit_stacked.png" id="18" name="Picture"/>
+                    <pic:cNvPr descr="../power_shaping/figures/fig_law_fit.png" id="18" name="Picture"/>
                     <pic:cNvPicPr>
                       <a:picLocks noChangeArrowheads="1" noChangeAspect="1"/>
                     </pic:cNvPicPr>
@@ -3709,7 +3734,7 @@
                   <pic:spPr bwMode="auto">
                     <a:xfrm>
                       <a:off x="0" y="0"/>
-                      <a:ext cx="2984601" cy="6132195"/>
+                      <a:ext cx="6400800" cy="2032839"/>
                     </a:xfrm>
                     <a:prstGeom prst="rect">
                       <a:avLst/>
@@ -3761,6 +3786,31 @@
         </w:rPr>
         <w:t>The response law P(θ)=P0+aθβ is a card property. One panel per GPU (A100, A10G, L4); each dot is a measured operating point for one of the 20 workloads in the loaded regime, with the rate normalized to that workload's own maximum and power to the card's TDP. All workloads closely follow a single fitted law per card (line), showing the exponent travels with the card, not the model: pooled fit R2 of 0.92 (A100), 0.88 (A10G), and 0.95 (L4), with β from about 1.5 on the L4 to 7.4 on the A10G.</w:t>
       </w:r>
+    </w:p>
+    <w:p>
+      <w:pPr>
+        <w:spacing w:before="0" w:after="0" w:line="440" w:lineRule="exact"/>
+        <w:rPr>
+          <w:sz w:val="2"/>
+          <w:szCs w:val="2"/>
+        </w:rPr>
+      </w:pPr>
+    </w:p>
+    <w:p>
+      <w:pPr>
+        <w:spacing w:before="0" w:after="0" w:line="20" w:lineRule="exact"/>
+        <w:rPr>
+          <w:sz w:val="2"/>
+          <w:szCs w:val="2"/>
+        </w:rPr>
+        <w:sectPr>
+          <w:type w:val="continuous"/>
+          <w:pgSz w:h="15840" w:w="12240"/>
+          <w:pgMar w:bottom="1080" w:footer="720" w:gutter="0" w:header="720" w:left="1080" w:right="1080" w:top="1080"/>
+          <w:cols w:num="1" w:space="288"/>
+          <w:docGrid w:linePitch="360"/>
+        </w:sectPr>
+      </w:pPr>
     </w:p>
     <w:bookmarkEnd w:id="19"/>
     <w:bookmarkStart w:id="26" w:name="Xdbe3ddcc6adf11a4ee78a812ec8f972c578c061"/>
@@ -5812,7 +5862,7 @@
       <w:r>
         <w:drawing>
           <wp:inline>
-            <wp:extent cx="2984601" cy="4434609"/>
+            <wp:extent cx="1846240" cy="2743200"/>
             <wp:effectExtent b="0" l="0" r="0" t="0"/>
             <wp:docPr descr="compute-power frontier" title="" id="28" name="Picture"/>
             <a:graphic>
@@ -5833,7 +5883,7 @@
                   <pic:spPr bwMode="auto">
                     <a:xfrm>
                       <a:off x="0" y="0"/>
-                      <a:ext cx="2984601" cy="4434609"/>
+                      <a:ext cx="1846240" cy="2743200"/>
                     </a:xfrm>
                     <a:prstGeom prst="rect">
                       <a:avLst/>

</xml_diff>

<commit_message>
2-col: all-black text; continuous columns (wide law/frontier handling, figure relocations, tighter refs; 11 pp, no half-empty columns)
Co-Authored-By: Claude Fable 5 <noreply@anthropic.com>
</commit_message>
<xml_diff>
--- a/docs/GPTEnergy_2col.docx
+++ b/docs/GPTEnergy_2col.docx
@@ -14,7 +14,7 @@
       </w:pPr>
       <w:r>
         <w:rPr>
-          <w:color w:val="14385C"/>
+          <w:color w:val="000000"/>
         </w:rPr>
         <w:t xml:space="preserve">The Joule Point: an Energy-Optimal Operating Point for AI Inference</w:t>
       </w:r>
@@ -55,7 +55,7 @@
             </w:pPr>
             <w:r>
               <w:rPr>
-                <w:color w:val="5A626C"/>
+                <w:color w:val="000000"/>
               </w:rPr>
             </w:r>
             <w:r>
@@ -63,7 +63,7 @@
                 <w:rFonts w:ascii="Georgia" w:hAnsi="Georgia"/>
                 <w:b/>
                 <w:i w:val="0"/>
-                <w:color w:val="2C3138"/>
+                <w:color w:val="000000"/>
                 <w:sz w:val="22"/>
               </w:rPr>
               <w:t>Alexander Apartsin</w:t>
@@ -73,7 +73,7 @@
                 <w:rFonts w:ascii="Georgia" w:hAnsi="Georgia"/>
                 <w:b/>
                 <w:i w:val="0"/>
-                <w:color w:val="5A626C"/>
+                <w:color w:val="000000"/>
                 <w:sz w:val="22"/>
                 <w:vertAlign w:val="superscript"/>
               </w:rPr>
@@ -84,7 +84,7 @@
                 <w:rFonts w:ascii="Georgia" w:hAnsi="Georgia"/>
                 <w:b/>
                 <w:i w:val="0"/>
-                <w:color w:val="2C3138"/>
+                <w:color w:val="000000"/>
                 <w:sz w:val="22"/>
               </w:rPr>
               <w:t xml:space="preserve"> </w:t>
@@ -94,7 +94,7 @@
                 <w:rFonts w:ascii="Georgia" w:hAnsi="Georgia"/>
                 <w:b/>
                 <w:i w:val="0"/>
-                <w:color w:val="2C3138"/>
+                <w:color w:val="000000"/>
                 <w:sz w:val="22"/>
               </w:rPr>
               <w:t xml:space="preserve"> ·  Yehudit Aperstein</w:t>
@@ -104,7 +104,7 @@
                 <w:rFonts w:ascii="Georgia" w:hAnsi="Georgia"/>
                 <w:b/>
                 <w:i w:val="0"/>
-                <w:color w:val="5A626C"/>
+                <w:color w:val="000000"/>
                 <w:sz w:val="22"/>
                 <w:vertAlign w:val="superscript"/>
               </w:rPr>
@@ -131,7 +131,7 @@
             </w:pPr>
             <w:r>
               <w:rPr>
-                <w:color w:val="5A626C"/>
+                <w:color w:val="000000"/>
               </w:rPr>
             </w:r>
             <w:r>
@@ -139,7 +139,7 @@
                 <w:rFonts w:ascii="Georgia" w:hAnsi="Georgia"/>
                 <w:b w:val="0"/>
                 <w:i/>
-                <w:color w:val="5A626C"/>
+                <w:color w:val="000000"/>
                 <w:sz w:val="19"/>
                 <w:vertAlign w:val="superscript"/>
               </w:rPr>
@@ -150,7 +150,7 @@
                 <w:rFonts w:ascii="Georgia" w:hAnsi="Georgia"/>
                 <w:b w:val="0"/>
                 <w:i/>
-                <w:color w:val="5A626C"/>
+                <w:color w:val="000000"/>
                 <w:sz w:val="19"/>
               </w:rPr>
               <w:t xml:space="preserve">Holon Institute of Technology, Holon, Israel   </w:t>
@@ -160,7 +160,7 @@
                 <w:rFonts w:ascii="Georgia" w:hAnsi="Georgia"/>
                 <w:b w:val="0"/>
                 <w:i/>
-                <w:color w:val="5A626C"/>
+                <w:color w:val="000000"/>
                 <w:sz w:val="19"/>
                 <w:vertAlign w:val="superscript"/>
               </w:rPr>
@@ -171,7 +171,7 @@
                 <w:rFonts w:ascii="Georgia" w:hAnsi="Georgia"/>
                 <w:b w:val="0"/>
                 <w:i/>
-                <w:color w:val="5A626C"/>
+                <w:color w:val="000000"/>
                 <w:sz w:val="19"/>
               </w:rPr>
               <w:t>Afeka Academic College of Engineering, Tel Aviv, Israel</w:t>
@@ -191,7 +191,7 @@
       <w:r>
         <w:rPr>
           <w:smallCaps/>
-          <w:color w:val="14385C"/>
+          <w:color w:val="000000"/>
         </w:rPr>
         <w:t xml:space="preserve">Abstract</w:t>
       </w:r>
@@ -366,7 +366,7 @@
       </w:pPr>
       <w:r>
         <w:rPr>
-          <w:color w:val="14385C"/>
+          <w:color w:val="000000"/>
         </w:rPr>
         <w:t xml:space="preserve">1. Introduction</w:t>
       </w:r>
@@ -1031,7 +1031,7 @@
       </w:pPr>
       <w:r>
         <w:rPr>
-          <w:color w:val="14385C"/>
+          <w:color w:val="000000"/>
         </w:rPr>
         <w:t xml:space="preserve">2. Related work</w:t>
       </w:r>
@@ -1791,7 +1791,7 @@
       </w:pPr>
       <w:r>
         <w:rPr>
-          <w:color w:val="14385C"/>
+          <w:color w:val="000000"/>
         </w:rPr>
         <w:t xml:space="preserve">3. Energy space and its calculus</w:t>
       </w:r>
@@ -2338,7 +2338,7 @@
       </w:pPr>
       <w:r>
         <w:rPr>
-          <w:color w:val="14385C"/>
+          <w:color w:val="000000"/>
         </w:rPr>
         <w:t xml:space="preserve">4. The ELF dataset</w:t>
       </w:r>
@@ -2786,7 +2786,7 @@
         <w:rPr>
           <w:b/>
           <w:i/>
-          <w:color w:val="14385C"/>
+          <w:color w:val="000000"/>
         </w:rPr>
         <w:t>Figure 1.</w:t>
       </w:r>
@@ -2794,7 +2794,7 @@
         <w:rPr>
           <w:b w:val="0"/>
           <w:i/>
-          <w:color w:val="3D434B"/>
+          <w:color w:val="000000"/>
         </w:rPr>
         <w:t xml:space="preserve"> </w:t>
       </w:r>
@@ -2802,7 +2802,7 @@
         <w:rPr>
           <w:b w:val="0"/>
           <w:i/>
-          <w:color w:val="3D434B"/>
+          <w:color w:val="000000"/>
         </w:rPr>
         <w:t>Watts or clock, the same energy curve. On the A10G (convnext_small, batch 512) the power-cap sweep (navy) and the graphics-clock sweep (orange) give the same energy per inference where their board-draw ranges overlap (mean difference about 3 per cent), and the clock reaches below the power cap's driver floor (dotted line) to a lower draw. Energy is normalized to the uncapped value.</w:t>
       </w:r>
@@ -2818,7 +2818,7 @@
       </w:pPr>
       <w:r>
         <w:rPr>
-          <w:color w:val="14385C"/>
+          <w:color w:val="000000"/>
         </w:rPr>
         <w:t xml:space="preserve">5. The response surface and its law</w:t>
       </w:r>
@@ -3766,7 +3766,7 @@
         <w:rPr>
           <w:b/>
           <w:i/>
-          <w:color w:val="14385C"/>
+          <w:color w:val="000000"/>
         </w:rPr>
         <w:t>Figure 2.</w:t>
       </w:r>
@@ -3774,7 +3774,7 @@
         <w:rPr>
           <w:b w:val="0"/>
           <w:i/>
-          <w:color w:val="3D434B"/>
+          <w:color w:val="000000"/>
         </w:rPr>
         <w:t xml:space="preserve"> </w:t>
       </w:r>
@@ -3782,7 +3782,7 @@
         <w:rPr>
           <w:b w:val="0"/>
           <w:i/>
-          <w:color w:val="3D434B"/>
+          <w:color w:val="000000"/>
         </w:rPr>
         <w:t>The response law P(θ)=P0+aθβ is a card property. One panel per GPU (A100, A10G, L4); each dot is a measured operating point for one of the 20 workloads in the loaded regime, with the rate normalized to that workload's own maximum and power to the card's TDP. All workloads closely follow a single fitted law per card (line), showing the exponent travels with the card, not the model: pooled fit R2 of 0.92 (A100), 0.88 (A10G), and 0.95 (L4), with β from about 1.5 on the L4 to 7.4 on the A10G.</w:t>
       </w:r>
@@ -3823,7 +3823,7 @@
       </w:pPr>
       <w:r>
         <w:rPr>
-          <w:color w:val="14385C"/>
+          <w:color w:val="000000"/>
         </w:rPr>
         <w:t xml:space="preserve">6. The Joule Point, and the price of reaching it</w:t>
       </w:r>
@@ -3944,91 +3944,6 @@
       </w:r>
       <w:r>
         <w:t xml:space="preserve">, the per-job cap that minimizes energy per inference. On the large GPUs it sits well below TDP, at a median 46 per cent of TDP on the A100 and 43 per cent on the A10G, and capping to it cuts energy per inference by 29 per cent (A100) and 31 per cent (A10G). The well is deep on the A100 and A10G and shallow on the L4, where the minimum lies below the power cap's reachable floor and is exposed only by the graphics clock (Section 9).</w:t>
-      </w:r>
-    </w:p>
-    <w:p>
-      <w:pPr>
-        <w:pStyle w:val="BodyText"/>
-        <w:jc w:val="center"/>
-        <w:keepNext/>
-        <w:keepLines/>
-        <w:widowControl w:val="1"/>
-      </w:pPr>
-      <w:r>
-        <w:drawing>
-          <wp:inline>
-            <wp:extent cx="2984601" cy="2059992"/>
-            <wp:effectExtent b="0" l="0" r="0" t="0"/>
-            <wp:docPr descr="energy U-shape on every card" title="" id="21" name="Picture"/>
-            <a:graphic>
-              <a:graphicData uri="http://schemas.openxmlformats.org/drawingml/2006/picture">
-                <pic:pic>
-                  <pic:nvPicPr>
-                    <pic:cNvPr descr="../power_shaping/figures/fig_energy_u.png" id="22" name="Picture"/>
-                    <pic:cNvPicPr>
-                      <a:picLocks noChangeArrowheads="1" noChangeAspect="1"/>
-                    </pic:cNvPicPr>
-                  </pic:nvPicPr>
-                  <pic:blipFill>
-                    <a:blip r:embed="rId20"/>
-                    <a:stretch>
-                      <a:fillRect/>
-                    </a:stretch>
-                  </pic:blipFill>
-                  <pic:spPr bwMode="auto">
-                    <a:xfrm>
-                      <a:off x="0" y="0"/>
-                      <a:ext cx="2984601" cy="2059992"/>
-                    </a:xfrm>
-                    <a:prstGeom prst="rect">
-                      <a:avLst/>
-                    </a:prstGeom>
-                    <a:noFill/>
-                    <a:ln w="9525">
-                      <a:noFill/>
-                      <a:headEnd/>
-                      <a:tailEnd/>
-                    </a:ln>
-                  </pic:spPr>
-                </pic:pic>
-              </a:graphicData>
-            </a:graphic>
-          </wp:inline>
-        </w:drawing>
-      </w:r>
-    </w:p>
-    <w:p>
-      <w:pPr>
-        <w:pStyle w:val="ImageCaption"/>
-        <w:spacing w:before="80" w:after="120" w:line="240" w:lineRule="auto"/>
-        <w:jc w:val="center"/>
-        <w:keepNext w:val="0"/>
-        <w:keepLines/>
-        <w:widowControl w:val="1"/>
-      </w:pPr>
-      <w:r>
-        <w:rPr>
-          <w:b/>
-          <w:i/>
-          <w:color w:val="14385C"/>
-        </w:rPr>
-        <w:t>Figure 3.</w:t>
-      </w:r>
-      <w:r>
-        <w:rPr>
-          <w:b w:val="0"/>
-          <w:i/>
-          <w:color w:val="3D434B"/>
-        </w:rPr>
-        <w:t xml:space="preserve"> </w:t>
-      </w:r>
-      <w:r>
-        <w:rPr>
-          <w:b w:val="0"/>
-          <w:i/>
-          <w:color w:val="3D434B"/>
-        </w:rPr>
-        <w:t>Every card has an energy U-shape, shown with the best-illustrating workload per card: energy per inference normalized to each card's own uncapped value (so every curve starts at 1.0 and dips by the energy saved), versus board draw as a fraction of TDP. The shaded band is one standard deviation over repetitions; the dot marks the Joule Point. Curves: ViT-B/32 on the A100, ResNet-50 on the A10G, and wide-ResNet-50 on the L4. The L4 reaches its interior minimum below the power-cap floor, so its well is exposed by lowering the graphics clock instead.</w:t>
       </w:r>
     </w:p>
     <w:p>
@@ -4647,6 +4562,91 @@
       <w:r>
         <w:drawing>
           <wp:inline>
+            <wp:extent cx="2984601" cy="2059992"/>
+            <wp:effectExtent b="0" l="0" r="0" t="0"/>
+            <wp:docPr descr="energy U-shape on every card" title="" id="21" name="Picture"/>
+            <a:graphic>
+              <a:graphicData uri="http://schemas.openxmlformats.org/drawingml/2006/picture">
+                <pic:pic>
+                  <pic:nvPicPr>
+                    <pic:cNvPr descr="../power_shaping/figures/fig_energy_u.png" id="22" name="Picture"/>
+                    <pic:cNvPicPr>
+                      <a:picLocks noChangeArrowheads="1" noChangeAspect="1"/>
+                    </pic:cNvPicPr>
+                  </pic:nvPicPr>
+                  <pic:blipFill>
+                    <a:blip r:embed="rId20"/>
+                    <a:stretch>
+                      <a:fillRect/>
+                    </a:stretch>
+                  </pic:blipFill>
+                  <pic:spPr bwMode="auto">
+                    <a:xfrm>
+                      <a:off x="0" y="0"/>
+                      <a:ext cx="2984601" cy="2059992"/>
+                    </a:xfrm>
+                    <a:prstGeom prst="rect">
+                      <a:avLst/>
+                    </a:prstGeom>
+                    <a:noFill/>
+                    <a:ln w="9525">
+                      <a:noFill/>
+                      <a:headEnd/>
+                      <a:tailEnd/>
+                    </a:ln>
+                  </pic:spPr>
+                </pic:pic>
+              </a:graphicData>
+            </a:graphic>
+          </wp:inline>
+        </w:drawing>
+      </w:r>
+    </w:p>
+    <w:p>
+      <w:pPr>
+        <w:pStyle w:val="ImageCaption"/>
+        <w:spacing w:before="80" w:after="120" w:line="240" w:lineRule="auto"/>
+        <w:jc w:val="center"/>
+        <w:keepNext w:val="0"/>
+        <w:keepLines/>
+        <w:widowControl w:val="1"/>
+      </w:pPr>
+      <w:r>
+        <w:rPr>
+          <w:b/>
+          <w:i/>
+          <w:color w:val="000000"/>
+        </w:rPr>
+        <w:t>Figure 3.</w:t>
+      </w:r>
+      <w:r>
+        <w:rPr>
+          <w:b w:val="0"/>
+          <w:i/>
+          <w:color w:val="000000"/>
+        </w:rPr>
+        <w:t xml:space="preserve"> </w:t>
+      </w:r>
+      <w:r>
+        <w:rPr>
+          <w:b w:val="0"/>
+          <w:i/>
+          <w:color w:val="000000"/>
+        </w:rPr>
+        <w:t>Every card has an energy U-shape, shown with the best-illustrating workload per card: energy per inference normalized to each card's own uncapped value (so every curve starts at 1.0 and dips by the energy saved), versus board draw as a fraction of TDP. The shaded band is one standard deviation over repetitions; the dot marks the Joule Point. Curves: ViT-B/32 on the A100, ResNet-50 on the A10G, and wide-ResNet-50 on the L4. The L4 reaches its interior minimum below the power-cap floor, so its well is exposed by lowering the graphics clock instead.</w:t>
+      </w:r>
+    </w:p>
+    <w:p>
+      <w:pPr>
+        <w:pStyle w:val="BodyText"/>
+        <w:jc w:val="center"/>
+        <w:keepNext/>
+        <w:keepLines/>
+        <w:widowControl w:val="1"/>
+      </w:pPr>
+      <w:r>
+        <w:drawing>
+          <wp:inline>
             <wp:extent cx="2984600" cy="1967262"/>
             <wp:effectExtent b="0" l="0" r="0" t="0"/>
             <wp:docPr descr="energy decomposition: power x time" title="" id="24" name="Picture"/>
@@ -4700,7 +4700,7 @@
         <w:rPr>
           <w:b/>
           <w:i/>
-          <w:color w:val="14385C"/>
+          <w:color w:val="000000"/>
         </w:rPr>
         <w:t>Figure 4.</w:t>
       </w:r>
@@ -4708,7 +4708,7 @@
         <w:rPr>
           <w:b w:val="0"/>
           <w:i/>
-          <w:color w:val="3D434B"/>
+          <w:color w:val="000000"/>
         </w:rPr>
         <w:t xml:space="preserve"> </w:t>
       </w:r>
@@ -4716,7 +4716,7 @@
         <w:rPr>
           <w:b w:val="0"/>
           <w:i/>
-          <w:color w:val="3D434B"/>
+          <w:color w:val="000000"/>
         </w:rPr>
         <w:t>Why energy per inference is U-shaped, and what lowering the operating point costs (A10G, ResNet-50, via the graphics clock), each series normalized to its uncapped value. As the operating point is lowered, board power per second drops (red) but each inference takes longer (orange); their product, energy per inference (navy), is minimized in between at the Joule Point (dot). Left of the Joule Point a small further energy saving costs a large latency rise; right of it a steep energy cost buys little speed.</w:t>
       </w:r>
@@ -4893,7 +4893,7 @@
         <w:rPr>
           <w:b/>
           <w:i/>
-          <w:color w:val="14385C"/>
+          <w:color w:val="000000"/>
         </w:rPr>
         <w:t>Table 1.</w:t>
       </w:r>
@@ -4901,7 +4901,7 @@
         <w:rPr>
           <w:b w:val="0"/>
           <w:i/>
-          <w:color w:val="3D434B"/>
+          <w:color w:val="000000"/>
         </w:rPr>
         <w:t xml:space="preserve"> </w:t>
       </w:r>
@@ -4909,7 +4909,7 @@
         <w:rPr>
           <w:b w:val="0"/>
           <w:i/>
-          <w:color w:val="3D434B"/>
+          <w:color w:val="000000"/>
         </w:rPr>
         <w:t>The Joule Point on the two large GPUs, under load: its location (per cent of TDP), the energy it saves per inference versus uncapped, the extra cards (equal to the latency ratio) needed to hold throughput, and the spread and penalty of using one fixed per-card cap across the twenty workloads.</w:t>
       </w:r>
@@ -5524,7 +5524,7 @@
       <w:r>
         <w:rPr>
           <w:i/>
-          <w:color w:val="2C3138"/>
+          <w:color w:val="000000"/>
         </w:rPr>
         <w:t xml:space="preserve">Under load, one static cap per card, set once, has a mean energy penalty below one per cent versus each job's own optimum, so the online per-job search that prior energy-aware systems run is unnecessary in this regime.</w:t>
       </w:r>
@@ -5552,7 +5552,7 @@
       </w:r>
     </w:p>
     <w:bookmarkEnd w:id="26"/>
-    <w:bookmarkStart w:id="30" w:name="X07386daecf40fedbd79a720cbc0bf8709520c71"/>
+    <w:bookmarkStart w:id="27" w:name="X07386daecf40fedbd79a720cbc0bf8709520c71"/>
     <w:p>
       <w:pPr>
         <w:pStyle w:val="Heading2"/>
@@ -5562,7 +5562,7 @@
       </w:pPr>
       <w:r>
         <w:rPr>
-          <w:color w:val="14385C"/>
+          <w:color w:val="000000"/>
         </w:rPr>
         <w:t xml:space="preserve">7. Scheduling in energy space: a fleet simulation</w:t>
       </w:r>
@@ -5854,6 +5854,214 @@
     <w:p>
       <w:pPr>
         <w:pStyle w:val="BodyText"/>
+        <w:jc w:val="both"/>
+        <w:keepNext w:val="0"/>
+        <w:keepLines w:val="0"/>
+        <w:widowControl w:val="1"/>
+      </w:pPr>
+      <w:r>
+        <w:t xml:space="preserve">The lever is also fast: stepping the power cap on a live A10G, board power settles to within five per cent of</w:t>
+      </w:r>
+      <w:r>
+        <w:t xml:space="preserve"> </w:t>
+      </w:r>
+      <w:r>
+        <w:t xml:space="preserve">the new level in a median 191 ms, and rests at the job's natural draw when the cap is inert, so cap</w:t>
+      </w:r>
+      <w:r>
+        <w:t xml:space="preserve"> </w:t>
+      </w:r>
+      <w:r>
+        <w:t xml:space="preserve">actuation is fast enough for second-scale control. As a concrete rule, ELF answers routing queries directly:</w:t>
+      </w:r>
+      <w:r>
+        <w:t xml:space="preserve"> </w:t>
+      </w:r>
+      <w:r>
+        <w:t xml:space="preserve">for LLM decode, whenever the latency budget is about 158 ms or looser, the lowest-board-energy option is a</w:t>
+      </w:r>
+      <w:r>
+        <w:t xml:space="preserve"> </w:t>
+      </w:r>
+      <w:r>
+        <w:t xml:space="preserve">single operating point, the A100 capped near 46 per cent of TDP, which meets that budget and is the</w:t>
+      </w:r>
+      <w:r>
+        <w:t xml:space="preserve"> </w:t>
+      </w:r>
+      <w:r>
+        <w:t xml:space="preserve">most efficient choice in the fleet; running the A100 uncapped or falling back to a smaller card is a visible</w:t>
+      </w:r>
+      <w:r>
+        <w:t xml:space="preserve"> </w:t>
+      </w:r>
+      <w:r>
+        <w:t xml:space="preserve">error. A binding cap also holds draw steady: uncapped A10G draw drifts by about 17 per cent as</w:t>
+      </w:r>
+      <w:r>
+        <w:t xml:space="preserve"> </w:t>
+      </w:r>
+      <w:r>
+        <w:t xml:space="preserve">the card warms, and a cap makes power predictable.</w:t>
+      </w:r>
+    </w:p>
+    <w:bookmarkEnd w:id="27"/>
+    <w:bookmarkStart w:id="31" w:name="X94196bdfd205e123d10441674579e6711711dc6"/>
+    <w:p>
+      <w:pPr>
+        <w:pStyle w:val="Heading2"/>
+        <w:keepNext/>
+        <w:keepLines/>
+        <w:widowControl w:val="1"/>
+      </w:pPr>
+      <w:r>
+        <w:rPr>
+          <w:color w:val="000000"/>
+        </w:rPr>
+        <w:t xml:space="preserve">8. Implications for AI data center operators</w:t>
+      </w:r>
+    </w:p>
+    <w:p>
+      <w:pPr>
+        <w:pStyle w:val="FirstParagraph"/>
+        <w:jc w:val="both"/>
+        <w:keepNext w:val="0"/>
+        <w:keepLines w:val="0"/>
+        <w:widowControl w:val="1"/>
+      </w:pPr>
+      <w:r>
+        <w:t xml:space="preserve">The following read directly off our measurements on the workloads and GPUs in ELF; they are prompts for</w:t>
+      </w:r>
+      <w:r>
+        <w:t xml:space="preserve"> </w:t>
+      </w:r>
+      <w:r>
+        <w:t xml:space="preserve">evaluation, not deployment prescriptions. Real decisions turn on factors we do not model here, arrival patterns,</w:t>
+      </w:r>
+      <w:r>
+        <w:t xml:space="preserve"> </w:t>
+      </w:r>
+      <w:r>
+        <w:t xml:space="preserve">production serving stacks, newer hardware, SLA and capacity economics, and carbon and power contracts, so each</w:t>
+      </w:r>
+      <w:r>
+        <w:t xml:space="preserve"> </w:t>
+      </w:r>
+      <w:r>
+        <w:t xml:space="preserve">point below is a hypothesis to test against a given fleet.</w:t>
+      </w:r>
+    </w:p>
+    <w:p>
+      <w:pPr>
+        <w:pStyle w:val="Compact"/>
+        <w:numPr>
+          <w:ilvl w:val="0"/>
+          <w:numId w:val="1002"/>
+        </w:numPr>
+        <w:ind w:left="360" w:hanging="259"/>
+        <w:jc w:val="both"/>
+        <w:keepNext w:val="0"/>
+        <w:keepLines w:val="0"/>
+        <w:widowControl w:val="1"/>
+      </w:pPr>
+      <w:r>
+        <w:rPr>
+          <w:i/>
+          <w:iCs/>
+        </w:rPr>
+        <w:t xml:space="preserve">A single static per-card cap may replace the per-job control loop, and is worth weighing against idling.</w:t>
+      </w:r>
+      <w:r>
+        <w:t xml:space="preserve"> </w:t>
+      </w:r>
+      <w:r>
+        <w:t xml:space="preserve">The energy-optimal cap moved little across our twenty workloads under load (Section 6), so the online, per-job search that energy-aware controllers run was unnecessary on every workload we measured; online control keeps its value in phase-varying or bursty regimes where the floor moves. On the operating points we measured, holding each GPU at that cap served the same work at roughly a quarter to a third less board energy (Section 6), the fleet controller spent 18 to 45 per cent less energy per served job (Section 7), and the cap settled in about 191 ms; whether that beats dropping or queueing work under a fluctuating budget is an experiment worth running.</w:t>
+      </w:r>
+    </w:p>
+    <w:p>
+      <w:pPr>
+        <w:pStyle w:val="Compact"/>
+        <w:numPr>
+          <w:ilvl w:val="0"/>
+          <w:numId w:val="1002"/>
+        </w:numPr>
+        <w:ind w:left="360" w:hanging="259"/>
+        <w:jc w:val="both"/>
+        <w:keepNext w:val="0"/>
+        <w:keepLines w:val="0"/>
+        <w:widowControl w:val="1"/>
+      </w:pPr>
+      <w:r>
+        <w:rPr>
+          <w:i/>
+          <w:iCs/>
+        </w:rPr>
+        <w:t xml:space="preserve">Whether capping costs cards or is effectively free is set by the fleet's regime (Figure 6).</w:t>
+      </w:r>
+      <w:r>
+        <w:t xml:space="preserve"> </w:t>
+      </w:r>
+      <w:r>
+        <w:t xml:space="preserve">Where a deployment is limited by the megawatts it can draw rather than the cards it can buy, the Joule Point is a capacity lever, not only an energy one: under a fixed power envelope, running each GPU at its energy-optimal point delivers more useful work per watt, so efficiency becomes throughput and the case for capping stops depending on the price of energy at all. Behind a 1 MW feed the measured A100 optimum sits near 5,500 cards and serves about 50 per cent more inferences per megawatt than running that power uncapped (Figure 6). The same holds under light or bursty demand: when the average request is small relative to the card (few FLOPs per inference) or arrivals leave the fleet below capacity, holding aggregate throughput needs no extra cards, so capping removes energy at no capital cost, though request latency still rises. The capex penalty of capping appears only once demand saturates the fleet; below saturation the energy saving stands alone, opposed only by the split incentive, and running near TDP is right only where power is plentiful and capital scarce.</w:t>
+      </w:r>
+    </w:p>
+    <w:p>
+      <w:pPr>
+        <w:pStyle w:val="Compact"/>
+        <w:numPr>
+          <w:ilvl w:val="0"/>
+          <w:numId w:val="1002"/>
+        </w:numPr>
+        <w:ind w:left="360" w:hanging="259"/>
+        <w:jc w:val="both"/>
+        <w:keepNext w:val="0"/>
+        <w:keepLines w:val="0"/>
+        <w:widowControl w:val="1"/>
+      </w:pPr>
+      <w:r>
+        <w:rPr>
+          <w:i/>
+          <w:iCs/>
+        </w:rPr>
+        <w:t xml:space="preserve">Sizing by energy per unit of work, not by peak TDP, exposes headroom the TDP number hides.</w:t>
+      </w:r>
+      <w:r>
+        <w:t xml:space="preserve"> </w:t>
+      </w:r>
+      <w:r>
+        <w:t xml:space="preserve">The efficient operating power sat near 43 to 46 per cent of rated TDP at the board level, and higher once node overhead is counted (Section 6); the roughly 1.24× extra cards needed to hold throughput is the explicit price to weigh, and whether it is worth paying depends on the price of energy relative to capital. How hard to cap depends on what latency is worth: keeping 95 per cent of a throughput utility (value that rises with each unit of throughput) on the A100 saved a median 13 per cent of energy, but 28 per cent under a deadline utility (value earned only for meeting the deadline), where finishing early buys nothing and the job can be capped harder for free.</w:t>
+      </w:r>
+    </w:p>
+    <w:p>
+      <w:pPr>
+        <w:pStyle w:val="Compact"/>
+        <w:numPr>
+          <w:ilvl w:val="0"/>
+          <w:numId w:val="1002"/>
+        </w:numPr>
+        <w:ind w:left="360" w:hanging="259"/>
+        <w:jc w:val="both"/>
+        <w:keepNext w:val="0"/>
+        <w:keepLines w:val="0"/>
+        <w:widowControl w:val="1"/>
+      </w:pPr>
+      <w:r>
+        <w:rPr>
+          <w:i/>
+          <w:iCs/>
+        </w:rPr>
+        <w:t xml:space="preserve">Pricing that ignores power pulls the wrong way, so realigning it is the main lever on the incentive to cap.</w:t>
+      </w:r>
+      <w:r>
+        <w:t xml:space="preserve"> </w:t>
+      </w:r>
+      <w:r>
+        <w:t xml:space="preserve">Cloud GPUs are billed by the hour, not the watt, so a renter minimizes cost by running uncapped, the energy-worst point, while the party that would gain from capping (the operator's power bill, the grid) does not pay the rent. A per-joule surcharge is too weak to close this: at $80 per MWh a $12,000 A100 must run about 43 years for its electricity to equal its purchase price, so the energy line-item is dwarfed by the card-hours. The levers that bite are structural: first-party operators pay both capex and energy and should target the Joule Point directly; carbon pricing or power-constrained allocation raises the value of a watt; and a discounted capped tier gives tenants a reason to run capped.</w:t>
+      </w:r>
+    </w:p>
+    <w:p>
+      <w:pPr>
+        <w:pStyle w:val="BodyText"/>
         <w:jc w:val="center"/>
         <w:keepNext/>
         <w:keepLines/>
@@ -5864,18 +6072,18 @@
           <wp:inline>
             <wp:extent cx="1846240" cy="2743200"/>
             <wp:effectExtent b="0" l="0" r="0" t="0"/>
-            <wp:docPr descr="compute-power frontier" title="" id="28" name="Picture"/>
+            <wp:docPr descr="compute-power frontier" title="" id="29" name="Picture"/>
             <a:graphic>
               <a:graphicData uri="http://schemas.openxmlformats.org/drawingml/2006/picture">
                 <pic:pic>
                   <pic:nvPicPr>
-                    <pic:cNvPr descr="../power_shaping/figures/fig_frontier_stacked.png" id="29" name="Picture"/>
+                    <pic:cNvPr descr="../power_shaping/figures/fig_frontier_stacked.png" id="30" name="Picture"/>
                     <pic:cNvPicPr>
                       <a:picLocks noChangeArrowheads="1" noChangeAspect="1"/>
                     </pic:cNvPicPr>
                   </pic:nvPicPr>
                   <pic:blipFill>
-                    <a:blip r:embed="rId27"/>
+                    <a:blip r:embed="rId28"/>
                     <a:stretch>
                       <a:fillRect/>
                     </a:stretch>
@@ -5915,7 +6123,7 @@
         <w:rPr>
           <w:b/>
           <w:i/>
-          <w:color w:val="14385C"/>
+          <w:color w:val="000000"/>
         </w:rPr>
         <w:t>Figure 5.</w:t>
       </w:r>
@@ -5923,7 +6131,7 @@
         <w:rPr>
           <w:b w:val="0"/>
           <w:i/>
-          <w:color w:val="3D434B"/>
+          <w:color w:val="000000"/>
         </w:rPr>
         <w:t xml:space="preserve"> </w:t>
       </w:r>
@@ -5931,9 +6139,60 @@
         <w:rPr>
           <w:b w:val="0"/>
           <w:i/>
-          <w:color w:val="3D434B"/>
+          <w:color w:val="000000"/>
         </w:rPr>
         <w:t>Compute-power frontier on a fleet of 18 identical A100s, one measured model per GPU, computed deterministically from the measured cap-sweep curves (repetitions averaged); this is the static allocation optimum, not the closed-loop trace. The x-axis sweeps the fleet power budget from 100 down to 40 per cent of the 7.2 kW total TDP. At each budget, energy-space allocation (each GPU its own cap, the exact optimum over the measured cap grid) is compared with the uniform baseline (one fleet-wide cap, the largest measured cap that fits the budget on all 18 GPUs). Left: useful compute, each model's throughput normalized to its own full-power peak and summed. Right: SLO goodput, the number of jobs whose latency stays within 10 per cent of that model's full-power latency. The advantage is modest for smooth throughput and decisive for goodput: as the budget tightens the uniform baseline collapses while the per-GPU assignment degrades gracefully. Both panels are computed on the saturating-batch sweeps, the loaded regime of Sections 5 to 7.</w:t>
+      </w:r>
+    </w:p>
+    <w:bookmarkEnd w:id="31"/>
+    <w:bookmarkStart w:id="35" w:name="limitations"/>
+    <w:p>
+      <w:pPr>
+        <w:pStyle w:val="Heading2"/>
+        <w:keepNext/>
+        <w:keepLines/>
+        <w:widowControl w:val="1"/>
+      </w:pPr>
+      <w:r>
+        <w:rPr>
+          <w:color w:val="000000"/>
+        </w:rPr>
+        <w:t xml:space="preserve">9. Limitations</w:t>
+      </w:r>
+    </w:p>
+    <w:p>
+      <w:pPr>
+        <w:pStyle w:val="FirstParagraph"/>
+        <w:jc w:val="both"/>
+        <w:keepNext w:val="0"/>
+        <w:keepLines w:val="0"/>
+        <w:widowControl w:val="1"/>
+      </w:pPr>
+      <w:r>
+        <w:t xml:space="preserve">What this paper establishes, it establishes by direct measurement: a superlinear power-response law across 20 models on three NVIDIA inference GPUs, a Joule Point that under load is a per-card constant, and a fleet result driven end to end by measured curves. These findings hold for the workloads, cards, and loaded regime we swept, one model per GPU at fixed batch and precision, and that scope maps directly onto the extensions we set out below. The closed-form Joule Point explains the physics, why an energy minimum exists and why the shared floor</w:t>
+      </w:r>
+      <w:r>
+        <w:t xml:space="preserve"> </w:t>
+      </w:r>
+      <m:oMath>
+        <m:sSub>
+          <m:e>
+            <m:r>
+              <m:t>P</m:t>
+            </m:r>
+          </m:e>
+          <m:sub>
+            <m:r>
+              <m:t>0</m:t>
+            </m:r>
+          </m:sub>
+        </m:sSub>
+      </m:oMath>
+      <w:r>
+        <w:t xml:space="preserve"> </w:t>
+      </w:r>
+      <w:r>
+        <w:t xml:space="preserve">makes it a per-card constant, while the deployed cap is set directly from the measured sweep; on the high-exponent cards the analytic optimum lands within about ten percentage points of TDP of that measured cap, and since the deployed cap uses the measurement the gap costs nothing. The cross-card relationships are scaling observations over three GPUs, so a fitted transfer model to unmeasured cards is future work, and the cap-sweep protocol that would build it carries over unchanged. That protocol extends directly to more workloads, more GPU generations and vendors, and a production serving engine such as vLLM or TensorRT-LLM (Section 10), where co-location, iteration-level batching, and a shifting prefill/decode mix would be exercised under live load. The economic analysis uses stated illustrative prices, card cost, electricity, and a four-year life, so its break-even figures scale transparently with those inputs.</w:t>
       </w:r>
     </w:p>
     <w:p>
@@ -5945,203 +6204,22 @@
         <w:widowControl w:val="1"/>
       </w:pPr>
       <w:r>
-        <w:t xml:space="preserve">The lever is also fast: stepping the power cap on a live A10G, board power settles to within five per cent of</w:t>
-      </w:r>
-      <w:r>
-        <w:t xml:space="preserve"> </w:t>
-      </w:r>
-      <w:r>
-        <w:t xml:space="preserve">the new level in a median 191 ms, and rests at the job's natural draw when the cap is inert, so cap</w:t>
-      </w:r>
-      <w:r>
-        <w:t xml:space="preserve"> </w:t>
-      </w:r>
-      <w:r>
-        <w:t xml:space="preserve">actuation is fast enough for second-scale control. As a concrete rule, ELF answers routing queries directly:</w:t>
-      </w:r>
-      <w:r>
-        <w:t xml:space="preserve"> </w:t>
-      </w:r>
-      <w:r>
-        <w:t xml:space="preserve">for LLM decode, whenever the latency budget is about 158 ms or looser, the lowest-board-energy option is a</w:t>
-      </w:r>
-      <w:r>
-        <w:t xml:space="preserve"> </w:t>
-      </w:r>
-      <w:r>
-        <w:t xml:space="preserve">single operating point, the A100 capped near 46 per cent of TDP, which meets that budget and is the</w:t>
-      </w:r>
-      <w:r>
-        <w:t xml:space="preserve"> </w:t>
-      </w:r>
-      <w:r>
-        <w:t xml:space="preserve">most efficient choice in the fleet; running the A100 uncapped or falling back to a smaller card is a visible</w:t>
-      </w:r>
-      <w:r>
-        <w:t xml:space="preserve"> </w:t>
-      </w:r>
-      <w:r>
-        <w:t xml:space="preserve">error. A binding cap also holds draw steady: uncapped A10G draw drifts by about 17 per cent as</w:t>
-      </w:r>
-      <w:r>
-        <w:t xml:space="preserve"> </w:t>
-      </w:r>
-      <w:r>
-        <w:t xml:space="preserve">the card warms, and a cap makes power predictable.</w:t>
-      </w:r>
-    </w:p>
-    <w:bookmarkEnd w:id="30"/>
-    <w:bookmarkStart w:id="34" w:name="X94196bdfd205e123d10441674579e6711711dc6"/>
-    <w:p>
-      <w:pPr>
-        <w:pStyle w:val="Heading2"/>
-        <w:keepNext/>
-        <w:keepLines/>
-        <w:widowControl w:val="1"/>
-      </w:pPr>
+        <w:t xml:space="preserve">The measurement scope is equally definite. Each load-regime operating point is a three-repetition sweep (the batch-32 collection uses two), so conclusions rest on whole-sweep trends rather than single cells, and every headline claim is of that kind. The first two-second window after a cap change under-reads board power while the card settles, which biases the reported savings downward; the numbers are a lower bound. Setting a cap requires</w:t>
+      </w:r>
+      <w:r>
+        <w:t xml:space="preserve"> </w:t>
+      </w:r>
       <w:r>
         <w:rPr>
-          <w:color w:val="14385C"/>
+          <w:rStyle w:val="VerbatimChar"/>
         </w:rPr>
-        <w:t xml:space="preserve">8. Implications for AI data center operators</w:t>
-      </w:r>
-    </w:p>
-    <w:p>
-      <w:pPr>
-        <w:pStyle w:val="FirstParagraph"/>
-        <w:jc w:val="both"/>
-        <w:keepNext w:val="0"/>
-        <w:keepLines w:val="0"/>
-        <w:widowControl w:val="1"/>
-      </w:pPr>
-      <w:r>
-        <w:t xml:space="preserve">The following read directly off our measurements on the workloads and GPUs in ELF; they are prompts for</w:t>
-      </w:r>
-      <w:r>
-        <w:t xml:space="preserve"> </w:t>
-      </w:r>
-      <w:r>
-        <w:t xml:space="preserve">evaluation, not deployment prescriptions. Real decisions turn on factors we do not model here, arrival patterns,</w:t>
-      </w:r>
-      <w:r>
-        <w:t xml:space="preserve"> </w:t>
-      </w:r>
-      <w:r>
-        <w:t xml:space="preserve">production serving stacks, newer hardware, SLA and capacity economics, and carbon and power contracts, so each</w:t>
-      </w:r>
-      <w:r>
-        <w:t xml:space="preserve"> </w:t>
-      </w:r>
-      <w:r>
-        <w:t xml:space="preserve">point below is a hypothesis to test against a given fleet.</w:t>
-      </w:r>
-    </w:p>
-    <w:p>
-      <w:pPr>
-        <w:pStyle w:val="Compact"/>
-        <w:numPr>
-          <w:ilvl w:val="0"/>
-          <w:numId w:val="1002"/>
-        </w:numPr>
-        <w:ind w:left="360" w:hanging="259"/>
-        <w:jc w:val="both"/>
-        <w:keepNext w:val="0"/>
-        <w:keepLines w:val="0"/>
-        <w:widowControl w:val="1"/>
-      </w:pPr>
-      <w:r>
-        <w:rPr>
-          <w:i/>
-          <w:iCs/>
-        </w:rPr>
-        <w:t xml:space="preserve">A single static per-card cap may replace the per-job control loop, and is worth weighing against idling.</w:t>
-      </w:r>
-      <w:r>
-        <w:t xml:space="preserve"> </w:t>
-      </w:r>
-      <w:r>
-        <w:t xml:space="preserve">The energy-optimal cap moved little across our twenty workloads under load (Section 6), so the online, per-job search that energy-aware controllers run was unnecessary on every workload we measured; online control keeps its value in phase-varying or bursty regimes where the floor moves. On the operating points we measured, holding each GPU at that cap served the same work at roughly a quarter to a third less board energy (Section 6), the fleet controller spent 18 to 45 per cent less energy per served job (Section 7), and the cap settled in about 191 ms; whether that beats dropping or queueing work under a fluctuating budget is an experiment worth running.</w:t>
-      </w:r>
-    </w:p>
-    <w:p>
-      <w:pPr>
-        <w:pStyle w:val="Compact"/>
-        <w:numPr>
-          <w:ilvl w:val="0"/>
-          <w:numId w:val="1002"/>
-        </w:numPr>
-        <w:ind w:left="360" w:hanging="259"/>
-        <w:jc w:val="both"/>
-        <w:keepNext w:val="0"/>
-        <w:keepLines w:val="0"/>
-        <w:widowControl w:val="1"/>
-      </w:pPr>
-      <w:r>
-        <w:rPr>
-          <w:i/>
-          <w:iCs/>
-        </w:rPr>
-        <w:t xml:space="preserve">Whether capping costs cards or is effectively free is set by the fleet's regime (Figure 6).</w:t>
-      </w:r>
-      <w:r>
-        <w:t xml:space="preserve"> </w:t>
-      </w:r>
-      <w:r>
-        <w:t xml:space="preserve">Where a deployment is limited by the megawatts it can draw rather than the cards it can buy, the Joule Point is a capacity lever, not only an energy one: under a fixed power envelope, running each GPU at its energy-optimal point delivers more useful work per watt, so efficiency becomes throughput and the case for capping stops depending on the price of energy at all. Behind a 1 MW feed the measured A100 optimum sits near 5,500 cards and serves about 50 per cent more inferences per megawatt than running that power uncapped (Figure 6). The same holds under light or bursty demand: when the average request is small relative to the card (few FLOPs per inference) or arrivals leave the fleet below capacity, holding aggregate throughput needs no extra cards, so capping removes energy at no capital cost, though request latency still rises. The capex penalty of capping appears only once demand saturates the fleet; below saturation the energy saving stands alone, opposed only by the split incentive, and running near TDP is right only where power is plentiful and capital scarce.</w:t>
-      </w:r>
-    </w:p>
-    <w:p>
-      <w:pPr>
-        <w:pStyle w:val="Compact"/>
-        <w:numPr>
-          <w:ilvl w:val="0"/>
-          <w:numId w:val="1002"/>
-        </w:numPr>
-        <w:ind w:left="360" w:hanging="259"/>
-        <w:jc w:val="both"/>
-        <w:keepNext w:val="0"/>
-        <w:keepLines w:val="0"/>
-        <w:widowControl w:val="1"/>
-      </w:pPr>
-      <w:r>
-        <w:rPr>
-          <w:i/>
-          <w:iCs/>
-        </w:rPr>
-        <w:t xml:space="preserve">Sizing by energy per unit of work, not by peak TDP, exposes headroom the TDP number hides.</w:t>
-      </w:r>
-      <w:r>
-        <w:t xml:space="preserve"> </w:t>
-      </w:r>
-      <w:r>
-        <w:t xml:space="preserve">The efficient operating power sat near 43 to 46 per cent of rated TDP at the board level, and higher once node overhead is counted (Section 6); the roughly 1.24× extra cards needed to hold throughput is the explicit price to weigh, and whether it is worth paying depends on the price of energy relative to capital. How hard to cap depends on what latency is worth: keeping 95 per cent of a throughput utility (value that rises with each unit of throughput) on the A100 saved a median 13 per cent of energy, but 28 per cent under a deadline utility (value earned only for meeting the deadline), where finishing early buys nothing and the job can be capped harder for free.</w:t>
-      </w:r>
-    </w:p>
-    <w:p>
-      <w:pPr>
-        <w:pStyle w:val="Compact"/>
-        <w:numPr>
-          <w:ilvl w:val="0"/>
-          <w:numId w:val="1002"/>
-        </w:numPr>
-        <w:ind w:left="360" w:hanging="259"/>
-        <w:jc w:val="both"/>
-        <w:keepNext w:val="0"/>
-        <w:keepLines w:val="0"/>
-        <w:widowControl w:val="1"/>
-      </w:pPr>
-      <w:r>
-        <w:rPr>
-          <w:i/>
-          <w:iCs/>
-        </w:rPr>
-        <w:t xml:space="preserve">Pricing that ignores power pulls the wrong way, so realigning it is the main lever on the incentive to cap.</w:t>
-      </w:r>
-      <w:r>
-        <w:t xml:space="preserve"> </w:t>
-      </w:r>
-      <w:r>
-        <w:t xml:space="preserve">Cloud GPUs are billed by the hour, not the watt, so a renter minimizes cost by running uncapped, the energy-worst point, while the party that would gain from capping (the operator's power bill, the grid) does not pay the rent. A per-joule surcharge is too weak to close this: at $80 per MWh a $12,000 A100 must run about 43 years for its electricity to equal its purchase price, so the energy line-item is dwarfed by the card-hours. The levers that bite are structural: first-party operators pay both capex and energy and should target the Joule Point directly; carbon pricing or power-constrained allocation raises the value of a watt; and a discounted capped tier gives tenants a reason to run capped.</w:t>
+        <w:t xml:space="preserve">nvidia-smi</w:t>
+      </w:r>
+      <w:r>
+        <w:t xml:space="preserve"> </w:t>
+      </w:r>
+      <w:r>
+        <w:t xml:space="preserve">privileges, which bare-metal and VM tenants hold, the tenancy tier where large fleets run; the fleet evaluation of Section 7 is trace-driven over measured curves, so a live deployment would test the law under production batching and arrival variation. Finally, as Section 4 and Figure 1 establish, the subject is the energy-optimal operating point and the knob is a detail: on the large GPUs the power cap reaches that point directly; on the L4 the cap floor (about 56 per cent of TDP) sits above it, so the locked clock reaches it instead (median 8 per cent saving); and the T4's cap range is too narrow to characterize the law, so it is released in ELF and held out of the quantitative analysis.</w:t>
       </w:r>
     </w:p>
     <w:p>
@@ -6157,18 +6235,18 @@
           <wp:inline>
             <wp:extent cx="2984601" cy="1945438"/>
             <wp:effectExtent b="0" l="0" r="0" t="0"/>
-            <wp:docPr descr="power-budget goodput" title="" id="32" name="Picture"/>
+            <wp:docPr descr="power-budget goodput" title="" id="33" name="Picture"/>
             <a:graphic>
               <a:graphicData uri="http://schemas.openxmlformats.org/drawingml/2006/picture">
                 <pic:pic>
                   <pic:nvPicPr>
-                    <pic:cNvPr descr="../power_shaping/figures/fig_power_budget_stacked.png" id="33" name="Picture"/>
+                    <pic:cNvPr descr="../power_shaping/figures/fig_power_budget_stacked.png" id="34" name="Picture"/>
                     <pic:cNvPicPr>
                       <a:picLocks noChangeArrowheads="1" noChangeAspect="1"/>
                     </pic:cNvPicPr>
                   </pic:nvPicPr>
                   <pic:blipFill>
-                    <a:blip r:embed="rId31"/>
+                    <a:blip r:embed="rId32"/>
                     <a:stretch>
                       <a:fillRect/>
                     </a:stretch>
@@ -6208,7 +6286,7 @@
         <w:rPr>
           <w:b/>
           <w:i/>
-          <w:color w:val="14385C"/>
+          <w:color w:val="000000"/>
         </w:rPr>
         <w:t>Figure 6.</w:t>
       </w:r>
@@ -6216,7 +6294,7 @@
         <w:rPr>
           <w:b w:val="0"/>
           <w:i/>
-          <w:color w:val="3D434B"/>
+          <w:color w:val="000000"/>
         </w:rPr>
         <w:t xml:space="preserve"> </w:t>
       </w:r>
@@ -6224,13 +6302,13 @@
         <w:rPr>
           <w:b w:val="0"/>
           <w:i/>
-          <w:color w:val="3D434B"/>
+          <w:color w:val="000000"/>
         </w:rPr>
         <w:t>When power, not capital, is the binding constraint, the Joule Point is the interior optimum. Behind a fixed 1 MW feed (illustrated on the A100 running ViT-B/32 at batch 64), installing more GPUs forces each to a deeper cap (top axis), shifting the megawatt from dynamic, useful compute (blue) to the static idle floor (grey, taken as the least measured board draw). Served inferences per MW (red) peak at the Joule Point, near 5,500 cards, about 50 per cent above running the same megawatt uncapped; installing more cards is strictly dominated, serving fewer inferences at higher per-request latency (orange, right axis, log scale). Both served throughput and latency are relative to the uncapped operating point (= 1.0, the 100 per cent-TDP reference). This is the power-limited, demand-saturated regime; where demand is limited instead, one installs only enough cards to meet it and caps to the least SLO-feasible power (Section 7).</w:t>
       </w:r>
     </w:p>
-    <w:bookmarkEnd w:id="34"/>
-    <w:bookmarkStart w:id="35" w:name="limitations"/>
+    <w:bookmarkEnd w:id="35"/>
+    <w:bookmarkStart w:id="36" w:name="conclusion-and-future-work"/>
     <w:p>
       <w:pPr>
         <w:pStyle w:val="Heading2"/>
@@ -6240,85 +6318,7 @@
       </w:pPr>
       <w:r>
         <w:rPr>
-          <w:color w:val="14385C"/>
-        </w:rPr>
-        <w:t xml:space="preserve">9. Limitations</w:t>
-      </w:r>
-    </w:p>
-    <w:p>
-      <w:pPr>
-        <w:pStyle w:val="FirstParagraph"/>
-        <w:jc w:val="both"/>
-        <w:keepNext w:val="0"/>
-        <w:keepLines w:val="0"/>
-        <w:widowControl w:val="1"/>
-      </w:pPr>
-      <w:r>
-        <w:t xml:space="preserve">What this paper establishes, it establishes by direct measurement: a superlinear power-response law across 20 models on three NVIDIA inference GPUs, a Joule Point that under load is a per-card constant, and a fleet result driven end to end by measured curves. These findings hold for the workloads, cards, and loaded regime we swept, one model per GPU at fixed batch and precision, and that scope maps directly onto the extensions we set out below. The closed-form Joule Point explains the physics, why an energy minimum exists and why the shared floor</w:t>
-      </w:r>
-      <w:r>
-        <w:t xml:space="preserve"> </w:t>
-      </w:r>
-      <m:oMath>
-        <m:sSub>
-          <m:e>
-            <m:r>
-              <m:t>P</m:t>
-            </m:r>
-          </m:e>
-          <m:sub>
-            <m:r>
-              <m:t>0</m:t>
-            </m:r>
-          </m:sub>
-        </m:sSub>
-      </m:oMath>
-      <w:r>
-        <w:t xml:space="preserve"> </w:t>
-      </w:r>
-      <w:r>
-        <w:t xml:space="preserve">makes it a per-card constant, while the deployed cap is set directly from the measured sweep; on the high-exponent cards the analytic optimum lands within about ten percentage points of TDP of that measured cap, and since the deployed cap uses the measurement the gap costs nothing. The cross-card relationships are scaling observations over three GPUs, so a fitted transfer model to unmeasured cards is future work, and the cap-sweep protocol that would build it carries over unchanged. That protocol extends directly to more workloads, more GPU generations and vendors, and a production serving engine such as vLLM or TensorRT-LLM (Section 10), where co-location, iteration-level batching, and a shifting prefill/decode mix would be exercised under live load. The economic analysis uses stated illustrative prices, card cost, electricity, and a four-year life, so its break-even figures scale transparently with those inputs.</w:t>
-      </w:r>
-    </w:p>
-    <w:p>
-      <w:pPr>
-        <w:pStyle w:val="BodyText"/>
-        <w:jc w:val="both"/>
-        <w:keepNext w:val="0"/>
-        <w:keepLines w:val="0"/>
-        <w:widowControl w:val="1"/>
-      </w:pPr>
-      <w:r>
-        <w:t xml:space="preserve">The measurement scope is equally definite. Each load-regime operating point is a three-repetition sweep (the batch-32 collection uses two), so conclusions rest on whole-sweep trends rather than single cells, and every headline claim is of that kind. The first two-second window after a cap change under-reads board power while the card settles, which biases the reported savings downward; the numbers are a lower bound. Setting a cap requires</w:t>
-      </w:r>
-      <w:r>
-        <w:t xml:space="preserve"> </w:t>
-      </w:r>
-      <w:r>
-        <w:rPr>
-          <w:rStyle w:val="VerbatimChar"/>
-        </w:rPr>
-        <w:t xml:space="preserve">nvidia-smi</w:t>
-      </w:r>
-      <w:r>
-        <w:t xml:space="preserve"> </w:t>
-      </w:r>
-      <w:r>
-        <w:t xml:space="preserve">privileges, which bare-metal and VM tenants hold, the tenancy tier where large fleets run; the fleet evaluation of Section 7 is trace-driven over measured curves, so a live deployment would test the law under production batching and arrival variation. Finally, as Section 4 and Figure 1 establish, the subject is the energy-optimal operating point and the knob is a detail: on the large GPUs the power cap reaches that point directly; on the L4 the cap floor (about 56 per cent of TDP) sits above it, so the locked clock reaches it instead (median 8 per cent saving); and the T4's cap range is too narrow to characterize the law, so it is released in ELF and held out of the quantitative analysis.</w:t>
-      </w:r>
-    </w:p>
-    <w:bookmarkEnd w:id="35"/>
-    <w:bookmarkStart w:id="36" w:name="conclusion-and-future-work"/>
-    <w:p>
-      <w:pPr>
-        <w:pStyle w:val="Heading2"/>
-        <w:keepNext/>
-        <w:keepLines/>
-        <w:widowControl w:val="1"/>
-      </w:pPr>
-      <w:r>
-        <w:rPr>
-          <w:color w:val="14385C"/>
+          <w:color w:val="000000"/>
         </w:rPr>
         <w:t xml:space="preserve">10. Conclusion and future work</w:t>
       </w:r>
@@ -6381,7 +6381,7 @@
       </w:pPr>
       <w:r>
         <w:rPr>
-          <w:color w:val="14385C"/>
+          <w:color w:val="000000"/>
         </w:rPr>
         <w:t xml:space="preserve">Data and code availability</w:t>
       </w:r>
@@ -6442,7 +6442,7 @@
       </w:pPr>
       <w:r>
         <w:rPr>
-          <w:color w:val="14385C"/>
+          <w:color w:val="000000"/>
         </w:rPr>
         <w:t xml:space="preserve">References</w:t>
       </w:r>
@@ -20592,7 +20592,7 @@
       <w:rFonts w:ascii="Georgia" w:hAnsi="Georgia"/>
       <w:b w:val="0"/>
       <w:i w:val="0"/>
-      <w:sz w:val="18"/>
+      <w:sz w:val="17"/>
     </w:rPr>
   </w:style>
   <w:style w:type="paragraph" w:customStyle="1" w:styleId="SourceCode">

</xml_diff>